<commit_message>
Close C1-W1 V12.2.1 publishing repair: real printable layouts.
Replace HTML/fence/ASCII/placeholder leaks with Word-table printables and embedded line-art PNGs; add deterministic publishing validation and honest visual QA so participant packets are owner-printable.

Co-authored-by: Cursor <cursoragent@cursor.com>
</commit_message>
<xml_diff>
--- a/exports/final/week1/KUTUMBA-C1-W1-FAMILY-ORIENTATION-AND-COVENANT-V12.2.docx
+++ b/exports/final/week1/KUTUMBA-C1-W1-FAMILY-ORIENTATION-AND-COVENANT-V12.2.docx
@@ -113,7 +113,7 @@
               <w:rPr>
                 <w:b/>
               </w:rPr>
-              <w:t>V12.2  •  Families Growing in Krishna Consciousness</w:t>
+              <w:t>V12.2.1  •  Families Growing in Krishna Consciousness</w:t>
               <w:br/>
               <w:t>Program Director: Swapnil Patil</w:t>
             </w:r>
@@ -984,8 +984,11 @@
     </w:p>
     <w:p>
       <w:pPr>
-        <w:pStyle w:val="ListNumber"/>
+        <w:ind w:left="288"/>
       </w:pPr>
+      <w:r>
+        <w:t xml:space="preserve">1. </w:t>
+      </w:r>
       <w:r>
         <w:rPr>
           <w:b/>
@@ -998,8 +1001,11 @@
     </w:p>
     <w:p>
       <w:pPr>
-        <w:pStyle w:val="ListNumber"/>
+        <w:ind w:left="288"/>
       </w:pPr>
+      <w:r>
+        <w:t xml:space="preserve">2. </w:t>
+      </w:r>
       <w:r>
         <w:rPr>
           <w:b/>
@@ -1012,8 +1018,11 @@
     </w:p>
     <w:p>
       <w:pPr>
-        <w:pStyle w:val="ListNumber"/>
+        <w:ind w:left="288"/>
       </w:pPr>
+      <w:r>
+        <w:t xml:space="preserve">3. </w:t>
+      </w:r>
       <w:r>
         <w:rPr>
           <w:b/>
@@ -1521,58 +1530,58 @@
     </w:p>
     <w:p>
       <w:pPr>
-        <w:pStyle w:val="ListNumber"/>
+        <w:ind w:left="288"/>
       </w:pPr>
       <w:r>
-        <w:t>Protect the Saturday calendar; communicate absences early.</w:t>
+        <w:t>1. Protect the Saturday calendar; communicate absences early.</w:t>
       </w:r>
     </w:p>
     <w:p>
       <w:pPr>
-        <w:pStyle w:val="ListNumber"/>
+        <w:ind w:left="288"/>
       </w:pPr>
       <w:r>
-        <w:t>Attempt a 5–15 minute home practice; minimum versions count as success.</w:t>
+        <w:t>2. Attempt a 5–15 minute home practice; minimum versions count as success.</w:t>
       </w:r>
     </w:p>
     <w:p>
       <w:pPr>
-        <w:pStyle w:val="ListNumber"/>
+        <w:ind w:left="288"/>
       </w:pPr>
       <w:r>
-        <w:t>Keep parents/caregivers onsite during the session.</w:t>
+        <w:t>3. Keep parents/caregivers onsite during the session.</w:t>
       </w:r>
     </w:p>
     <w:p>
       <w:pPr>
-        <w:pStyle w:val="ListNumber"/>
+        <w:ind w:left="288"/>
       </w:pPr>
       <w:r>
-        <w:t>Respect host-home property and common-area rules.</w:t>
+        <w:t>4. Respect host-home property and common-area rules.</w:t>
       </w:r>
     </w:p>
     <w:p>
       <w:pPr>
-        <w:pStyle w:val="ListNumber"/>
+        <w:ind w:left="288"/>
       </w:pPr>
       <w:r>
-        <w:t>Follow child house rules; support the correction ladder without public shame.</w:t>
+        <w:t>5. Follow child house rules; support the correction ladder without public shame.</w:t>
       </w:r>
     </w:p>
     <w:p>
       <w:pPr>
-        <w:pStyle w:val="ListNumber"/>
+        <w:ind w:left="288"/>
       </w:pPr>
       <w:r>
-        <w:t>Avoid gossip, comparison, and publishing private family/child data.</w:t>
+        <w:t>6. Avoid gossip, comparison, and publishing private family/child data.</w:t>
       </w:r>
     </w:p>
     <w:p>
       <w:pPr>
-        <w:pStyle w:val="ListNumber"/>
+        <w:ind w:left="288"/>
       </w:pPr>
       <w:r>
-        <w:t>Bring questions privately when needed; do not demand speculative answers.</w:t>
+        <w:t>7. Bring questions privately when needed; do not demand speculative answers.</w:t>
       </w:r>
     </w:p>
     <w:p>
@@ -2205,8 +2214,11 @@
     </w:p>
     <w:p>
       <w:pPr>
-        <w:pStyle w:val="ListNumber"/>
+        <w:ind w:left="288"/>
       </w:pPr>
+      <w:r>
+        <w:t xml:space="preserve">1. </w:t>
+      </w:r>
       <w:r>
         <w:rPr>
           <w:b/>
@@ -2219,8 +2231,11 @@
     </w:p>
     <w:p>
       <w:pPr>
-        <w:pStyle w:val="ListNumber"/>
+        <w:ind w:left="288"/>
       </w:pPr>
+      <w:r>
+        <w:t xml:space="preserve">2. </w:t>
+      </w:r>
       <w:r>
         <w:rPr>
           <w:b/>
@@ -2233,8 +2248,11 @@
     </w:p>
     <w:p>
       <w:pPr>
-        <w:pStyle w:val="ListNumber"/>
+        <w:ind w:left="288"/>
       </w:pPr>
+      <w:r>
+        <w:t xml:space="preserve">3. </w:t>
+      </w:r>
       <w:r>
         <w:rPr>
           <w:b/>
@@ -2247,8 +2265,11 @@
     </w:p>
     <w:p>
       <w:pPr>
-        <w:pStyle w:val="ListNumber"/>
+        <w:ind w:left="288"/>
       </w:pPr>
+      <w:r>
+        <w:t xml:space="preserve">4. </w:t>
+      </w:r>
       <w:r>
         <w:rPr>
           <w:b/>
@@ -2261,8 +2282,11 @@
     </w:p>
     <w:p>
       <w:pPr>
-        <w:pStyle w:val="ListNumber"/>
+        <w:ind w:left="288"/>
       </w:pPr>
+      <w:r>
+        <w:t xml:space="preserve">5. </w:t>
+      </w:r>
       <w:r>
         <w:rPr>
           <w:b/>
@@ -2275,8 +2299,11 @@
     </w:p>
     <w:p>
       <w:pPr>
-        <w:pStyle w:val="ListNumber"/>
+        <w:ind w:left="288"/>
       </w:pPr>
+      <w:r>
+        <w:t xml:space="preserve">6. </w:t>
+      </w:r>
       <w:r>
         <w:rPr>
           <w:b/>
@@ -2289,8 +2316,11 @@
     </w:p>
     <w:p>
       <w:pPr>
-        <w:pStyle w:val="ListNumber"/>
+        <w:ind w:left="288"/>
       </w:pPr>
+      <w:r>
+        <w:t xml:space="preserve">7. </w:t>
+      </w:r>
       <w:r>
         <w:rPr>
           <w:b/>
@@ -2303,8 +2333,11 @@
     </w:p>
     <w:p>
       <w:pPr>
-        <w:pStyle w:val="ListNumber"/>
+        <w:ind w:left="288"/>
       </w:pPr>
+      <w:r>
+        <w:t xml:space="preserve">8. </w:t>
+      </w:r>
       <w:r>
         <w:rPr>
           <w:b/>
@@ -2317,8 +2350,11 @@
     </w:p>
     <w:p>
       <w:pPr>
-        <w:pStyle w:val="ListNumber"/>
+        <w:ind w:left="288"/>
       </w:pPr>
+      <w:r>
+        <w:t xml:space="preserve">9. </w:t>
+      </w:r>
       <w:r>
         <w:rPr>
           <w:b/>
@@ -2331,8 +2367,11 @@
     </w:p>
     <w:p>
       <w:pPr>
-        <w:pStyle w:val="ListNumber"/>
+        <w:ind w:left="288"/>
       </w:pPr>
+      <w:r>
+        <w:t xml:space="preserve">10. </w:t>
+      </w:r>
       <w:r>
         <w:rPr>
           <w:b/>
@@ -2345,8 +2384,11 @@
     </w:p>
     <w:p>
       <w:pPr>
-        <w:pStyle w:val="ListNumber"/>
+        <w:ind w:left="288"/>
       </w:pPr>
+      <w:r>
+        <w:t xml:space="preserve">11. </w:t>
+      </w:r>
       <w:r>
         <w:rPr>
           <w:b/>
@@ -2359,8 +2401,11 @@
     </w:p>
     <w:p>
       <w:pPr>
-        <w:pStyle w:val="ListNumber"/>
+        <w:ind w:left="288"/>
       </w:pPr>
+      <w:r>
+        <w:t xml:space="preserve">12. </w:t>
+      </w:r>
       <w:r>
         <w:rPr>
           <w:b/>
@@ -3379,90 +3424,90 @@
     </w:p>
     <w:p>
       <w:pPr>
-        <w:pStyle w:val="ListNumber"/>
+        <w:ind w:left="288"/>
       </w:pPr>
       <w:r>
-        <w:t>Keep your body safe — feet on the floor; hands gentle.</w:t>
+        <w:t>1. Keep your body safe — feet on the floor; hands gentle.</w:t>
       </w:r>
     </w:p>
     <w:p>
       <w:pPr>
-        <w:pStyle w:val="ListNumber"/>
+        <w:ind w:left="288"/>
       </w:pPr>
       <w:r>
-        <w:t>Use respectful speech — no teasing, yelling, or mean labels.</w:t>
+        <w:t>2. Use respectful speech — no teasing, yelling, or mean labels.</w:t>
       </w:r>
     </w:p>
     <w:p>
       <w:pPr>
-        <w:pStyle w:val="ListNumber"/>
+        <w:ind w:left="288"/>
       </w:pPr>
       <w:r>
-        <w:t>Follow the facilitator safety cue immediately (pause / freeze / come here).</w:t>
+        <w:t>3. Follow the facilitator safety cue immediately (pause / freeze / come here).</w:t>
       </w:r>
     </w:p>
     <w:p>
       <w:pPr>
-        <w:pStyle w:val="ListNumber"/>
+        <w:ind w:left="288"/>
       </w:pPr>
       <w:r>
-        <w:t>No jumping on furniture.</w:t>
+        <w:t>4. No jumping on furniture.</w:t>
       </w:r>
     </w:p>
     <w:p>
       <w:pPr>
-        <w:pStyle w:val="ListNumber"/>
+        <w:ind w:left="288"/>
       </w:pPr>
       <w:r>
-        <w:t>No indoor throwing.</w:t>
+        <w:t>5. No indoor throwing.</w:t>
       </w:r>
     </w:p>
     <w:p>
       <w:pPr>
-        <w:pStyle w:val="ListNumber"/>
+        <w:ind w:left="288"/>
       </w:pPr>
       <w:r>
-        <w:t>No writing on walls, books, or furniture that are not activity materials.</w:t>
+        <w:t>6. No writing on walls, books, or furniture that are not activity materials.</w:t>
       </w:r>
     </w:p>
     <w:p>
       <w:pPr>
-        <w:pStyle w:val="ListNumber"/>
+        <w:ind w:left="288"/>
       </w:pPr>
       <w:r>
-        <w:t>Ask before entering private rooms.</w:t>
+        <w:t>7. Ask before entering private rooms.</w:t>
       </w:r>
     </w:p>
     <w:p>
       <w:pPr>
-        <w:pStyle w:val="ListNumber"/>
+        <w:ind w:left="288"/>
       </w:pPr>
       <w:r>
-        <w:t>Respect belongings — ask before touching what is not yours.</w:t>
+        <w:t>8. Respect belongings — ask before touching what is not yours.</w:t>
       </w:r>
     </w:p>
     <w:p>
       <w:pPr>
-        <w:pStyle w:val="ListNumber"/>
+        <w:ind w:left="288"/>
       </w:pPr>
       <w:r>
-        <w:t>Devices away unless the lesson specifically needs them.</w:t>
+        <w:t>9. Devices away unless the lesson specifically needs them.</w:t>
       </w:r>
     </w:p>
     <w:p>
       <w:pPr>
-        <w:pStyle w:val="ListNumber"/>
+        <w:ind w:left="288"/>
       </w:pPr>
       <w:r>
-        <w:t>Snack only in the allowed area; water anytime with permission.</w:t>
+        <w:t>10. Snack only in the allowed area; water anytime with permission.</w:t>
       </w:r>
     </w:p>
     <w:p>
       <w:pPr>
-        <w:pStyle w:val="ListNumber"/>
+        <w:ind w:left="288"/>
       </w:pPr>
       <w:r>
-        <w:t>Help clean up before leaving.</w:t>
+        <w:t>11. Help clean up before leaving.</w:t>
       </w:r>
     </w:p>
     <w:p>
@@ -3475,50 +3520,50 @@
     </w:p>
     <w:p>
       <w:pPr>
-        <w:pStyle w:val="ListNumber"/>
+        <w:ind w:left="288"/>
       </w:pPr>
       <w:r>
-        <w:t>Calm reminder</w:t>
+        <w:t xml:space="preserve">1. Calm reminder  </w:t>
       </w:r>
     </w:p>
     <w:p>
       <w:pPr>
-        <w:pStyle w:val="ListNumber"/>
+        <w:ind w:left="288"/>
       </w:pPr>
       <w:r>
-        <w:t>Redirect / offer a choice</w:t>
+        <w:t xml:space="preserve">2. Redirect / offer a choice  </w:t>
       </w:r>
     </w:p>
     <w:p>
       <w:pPr>
-        <w:pStyle w:val="ListNumber"/>
+        <w:ind w:left="288"/>
       </w:pPr>
       <w:r>
-        <w:t>Brief quiet reset in a visible space</w:t>
+        <w:t xml:space="preserve">3. Brief quiet reset in a visible space  </w:t>
       </w:r>
     </w:p>
     <w:p>
       <w:pPr>
-        <w:pStyle w:val="ListNumber"/>
+        <w:ind w:left="288"/>
       </w:pPr>
       <w:r>
-        <w:t>Parent involvement</w:t>
+        <w:t xml:space="preserve">4. Parent involvement  </w:t>
       </w:r>
     </w:p>
     <w:p>
       <w:pPr>
-        <w:pStyle w:val="ListNumber"/>
+        <w:ind w:left="288"/>
       </w:pPr>
       <w:r>
-        <w:t>Sit out a specific activity</w:t>
+        <w:t xml:space="preserve">5. Sit out a specific activity  </w:t>
       </w:r>
     </w:p>
     <w:p>
       <w:pPr>
-        <w:pStyle w:val="ListNumber"/>
+        <w:ind w:left="288"/>
       </w:pPr>
       <w:r>
-        <w:t>Private parent/program conversation for repeated patterns</w:t>
+        <w:t xml:space="preserve">6. Private parent/program conversation for repeated patterns  </w:t>
       </w:r>
     </w:p>
     <w:p>
@@ -3803,7 +3848,7 @@
         <w:color w:val="4F7C78"/>
         <w:sz w:val="17"/>
       </w:rPr>
-      <w:t>C1-W1 • V12.2  |  Families</w:t>
+      <w:t>C1-W1 • V12.2.1  |  Families</w:t>
     </w:r>
   </w:p>
 </w:hdr>

</xml_diff>